<commit_message>
Add turn and game clocks to X-ray Blackjack
30 s per turn (timeout = that team STANDS) and a 3:00 game clock (end =
both teams STAND). Adds Pause (P), toast messages, clock display, a sixth
rule on the Rules screen, and updates deck, script and checklist timing.

Co-Authored-By: Claude Sonnet 5.5 <noreply@anthropic.com>
</commit_message>
<xml_diff>
--- a/Script_EN_VI.docx
+++ b/Script_EN_VI.docx
@@ -2113,7 +2113,7 @@
     </w:p>
     <w:p>
       <w:r>
-        <w:t>Speaker: D   ·   Time: 2:30</w:t>
+        <w:t>Speaker: D   ·   Time: 3:20</w:t>
       </w:r>
     </w:p>
     <w:tbl>
@@ -2277,7 +2277,7 @@
                 <w:b w:val="0"/>
                 <w:sz w:val="22"/>
               </w:rPr>
-              <w:t>Up to four rounds, or say STAND if you think you are close enough. If one team stands, the other keeps playing its remaining rounds, so standing early gains nothing. Your last image is your submission. Score is quality times two, minus dose. Quality stays hidden; the dose bar turns amber, then red.</w:t>
+              <w:t>Up to four rounds, or say STAND if you think you are close enough. If one team stands, the other keeps playing its remaining rounds, so standing early gains nothing. Two clocks run: thirty seconds per turn, and three minutes for the whole game. If your turn clock runs out your team stands at once; when the game clock ends, both teams stand. Your last image is your submission. Score is quality times two, minus dose. Quality stays hidden; the dose bar turns amber, then red.</w:t>
             </w:r>
           </w:p>
         </w:tc>
@@ -2293,7 +2293,7 @@
                 <w:b w:val="0"/>
                 <w:sz w:val="22"/>
               </w:rPr>
-              <w:t>Tối đa bốn vòng, hoặc nói STAND nếu thấy đã đủ gần. Nếu một đội dừng, đội kia vẫn chơi tiếp các vòng còn lại, nên dừng sớm không có lợi thế. Ảnh cuối cùng là bài nộp. Điểm bằng chất lượng nhân hai trừ liều. Chất lượng bị ẩn; thanh liều chuyển sang vàng rồi đỏ.</w:t>
+              <w:t>Tối đa bốn vòng, hoặc nói STAND nếu thấy đã đủ gần. Nếu một đội dừng, đội kia vẫn chơi tiếp các vòng còn lại, nên dừng sớm không có lợi thế. Có hai đồng hồ: ba mươi giây mỗi lượt và ba phút cho cả trò chơi. Hết giờ lượt thì đội đó dừng ngay; hết giờ chung thì cả hai đội dừng. Ảnh cuối cùng là bài nộp. Điểm bằng chất lượng nhân hai trừ liều. Chất lượng bị ẩn; thanh liều chuyển sang vàng rồi đỏ.</w:t>
             </w:r>
           </w:p>
         </w:tc>
@@ -2311,7 +2311,7 @@
                 <w:b w:val="0"/>
                 <w:sz w:val="22"/>
               </w:rPr>
-              <w:t>[Run 4 rounds, about 25 seconds each. Captain calls the card within 10 seconds. After the last round press Reveal and read the scores.] That was X-ray Blackjack. Now let us see what the screen could not show you.</w:t>
+              <w:t>[Run up to 4 rounds within the 3:00 game clock; each turn has a 30 s clock (timeout = STAND). Captains call cards quickly. After the last round press Reveal and read the scores.] That was X-ray Blackjack. Now let us see what the screen could not show you.</w:t>
             </w:r>
           </w:p>
         </w:tc>
@@ -3585,7 +3585,7 @@
         <w:pStyle w:val="ListNumber"/>
       </w:pPr>
       <w:r>
-        <w:t>If one team stands, the other keeps playing its remaining rounds. A mistake? Press U (undo). C collects Team Left’s hand-vote on cards when the captain cannot decide.</w:t>
+        <w:t>If one team stands, the other keeps playing its remaining rounds. P pauses both clocks. A mistake? Press U (undo). C collects Team Left’s hand-vote on cards when the captain cannot decide.</w:t>
       </w:r>
     </w:p>
     <w:p>

</xml_diff>

<commit_message>
Blackjack: no-copy no longer blocks on a team's consecutive second turn
The block now applies only to the turn directly after the opponent's move.
Docs, slide 11 and script updated.

Co-Authored-By: Claude Sonnet 5.5 <noreply@anthropic.com>
</commit_message>
<xml_diff>
--- a/Script_EN_VI.docx
+++ b/Script_EN_VI.docx
@@ -2243,7 +2243,7 @@
                 <w:b w:val="0"/>
                 <w:sz w:val="22"/>
               </w:rPr>
-              <w:t>Each turn you play one multiplier card. It multiplies your last scan, so cards chain: times six, then times one and a half, is nine times the start. You see your new image, and so does the other team. Once anyone has played, the original grainy image appears in a fourth column so you can judge how far you have come. Turn order: the first team plays once, then the other team plays twice in a row, as its trade for going second, and then they alternate. You cannot play the card your opponent played last, so no copying.</w:t>
+              <w:t>Each turn you play one multiplier card. It multiplies your last scan, so cards chain: times six, then times one and a half, is nine times the start. You see your new image, and so does the other team. Once anyone has played, the original grainy image appears in a fourth column so you can judge how far you have come. Turn order: the first team plays once, then the other team plays twice in a row, as its trade for going second, and then they alternate. You cannot play the card your opponent just played, so no copying; your second turn in a row is free.</w:t>
             </w:r>
           </w:p>
         </w:tc>
@@ -2259,7 +2259,7 @@
                 <w:b w:val="0"/>
                 <w:sz w:val="22"/>
               </w:rPr>
-              <w:t>Mỗi lượt, đội chơi một thẻ nhân. Thẻ nhân lên phơi sáng của lần chụp gần nhất, nên các thẻ cộng dồn: ×6 rồi ×1,5 là gấp 9 lần ban đầu. Ảnh mới hiện ra cho cả hai đội cùng xem. Khi có đội đã chơi, ảnh nhiễu ban đầu hiện ở cột thứ tư để mọi người so sánh mức tiến bộ. Thứ tự lượt: đội đi trước chơi một lần, sau đó đội còn lại chơi hai lượt liên tiếp (bù lại vì đi sau), rồi hai đội luân phiên. Không được chơi thẻ mà đối thủ vừa chơi ở lượt gần nhất.</w:t>
+              <w:t>Mỗi lượt, đội chơi một thẻ nhân. Thẻ nhân lên phơi sáng của lần chụp gần nhất, nên các thẻ cộng dồn: ×6 rồi ×1,5 là gấp 9 lần ban đầu. Ảnh mới hiện ra cho cả hai đội cùng xem. Khi có đội đã chơi, ảnh nhiễu ban đầu hiện ở cột thứ tư để mọi người so sánh mức tiến bộ. Thứ tự lượt: đội đi trước chơi một lần, sau đó đội còn lại chơi hai lượt liên tiếp (bù lại vì đi sau), rồi hai đội luân phiên. Không được chơi thẻ mà đối thủ vừa chơi ngay trước đó; lượt thứ hai liên tiếp của bạn thì không bị chặn.</w:t>
             </w:r>
           </w:p>
         </w:tc>
@@ -3577,7 +3577,7 @@
         <w:pStyle w:val="ListNumber"/>
       </w:pPr>
       <w:r>
-        <w:t>B enforces “no copy” (the card your opponent played last is greyed out), checks the turn order (first team once, other team twice in a row, then alternate), and announces the dose-bar colour (green → amber → red).</w:t>
+        <w:t>B enforces “no copy” (the card your opponent just played is greyed out, except on a team's 2nd consecutive turn), checks the turn order (first team once, other team twice in a row, then alternate), and announces the dose-bar colour (green → amber → red).</w:t>
       </w:r>
     </w:p>
     <w:p>

</xml_diff>